<commit_message>
update(Content): Updated Projects and Fixed download CV button
</commit_message>
<xml_diff>
--- a/cv/Emmit_Christopher_CV.docx
+++ b/cv/Emmit_Christopher_CV.docx
@@ -1,6 +1,6 @@
 
 <file path=word/document.xml><?xml version="1.0" encoding="utf-8"?>
-<w:document xmlns:wpc="http://schemas.microsoft.com/office/word/2010/wordprocessingCanvas" xmlns:cx="http://schemas.microsoft.com/office/drawing/2014/chartex" xmlns:cx1="http://schemas.microsoft.com/office/drawing/2015/9/8/chartex" xmlns:cx2="http://schemas.microsoft.com/office/drawing/2015/10/21/chartex" xmlns:cx3="http://schemas.microsoft.com/office/drawing/2016/5/9/chartex" xmlns:cx4="http://schemas.microsoft.com/office/drawing/2016/5/10/chartex" xmlns:cx5="http://schemas.microsoft.com/office/drawing/2016/5/11/chartex" xmlns:cx6="http://schemas.microsoft.com/office/drawing/2016/5/12/chartex" xmlns:cx7="http://schemas.microsoft.com/office/drawing/2016/5/13/chartex" xmlns:cx8="http://schemas.microsoft.com/office/drawing/2016/5/14/chartex" xmlns:mc="http://schemas.openxmlformats.org/markup-compatibility/2006" xmlns:aink="http://schemas.microsoft.com/office/drawing/2016/ink" xmlns:am3d="http://schemas.microsoft.com/office/drawing/2017/model3d" xmlns:o="urn:schemas-microsoft-com:office:office" xmlns:oel="http://schemas.microsoft.com/office/2019/extlst" xmlns:r="http://schemas.openxmlformats.org/officeDocument/2006/relationships" xmlns:m="http://schemas.openxmlformats.org/officeDocument/2006/math" xmlns:v="urn:schemas-microsoft-com:vml" xmlns:wp14="http://schemas.microsoft.com/office/word/2010/wordprocessingDrawing" xmlns:wp="http://schemas.openxmlformats.org/drawingml/2006/wordprocessingDrawing" xmlns:w10="urn:schemas-microsoft-com:office:word" xmlns:w="http://schemas.openxmlformats.org/wordprocessingml/2006/main" xmlns:w14="http://schemas.microsoft.com/office/word/2010/wordml" xmlns:w15="http://schemas.microsoft.com/office/word/2012/wordml" xmlns:w16cex="http://schemas.microsoft.com/office/word/2018/wordml/cex" xmlns:w16cid="http://schemas.microsoft.com/office/word/2016/wordml/cid" xmlns:w16="http://schemas.microsoft.com/office/word/2018/wordml" xmlns:w16du="http://schemas.microsoft.com/office/word/2023/wordml/word16du" xmlns:w16sdtdh="http://schemas.microsoft.com/office/word/2020/wordml/sdtdatahash" xmlns:w16sdtfl="http://schemas.microsoft.com/office/word/2024/wordml/sdtformatlock" xmlns:w16se="http://schemas.microsoft.com/office/word/2015/wordml/symex" xmlns:wpg="http://schemas.microsoft.com/office/word/2010/wordprocessingGroup" xmlns:wpi="http://schemas.microsoft.com/office/word/2010/wordprocessingInk" xmlns:wne="http://schemas.microsoft.com/office/word/2006/wordml" xmlns:wps="http://schemas.microsoft.com/office/word/2010/wordprocessingShape" mc:Ignorable="w14 w15 w16se w16cid w16 w16cex w16sdtdh w16sdtfl w16du wp14">
+<w:document xmlns:wpc="http://schemas.microsoft.com/office/word/2010/wordprocessingCanvas" xmlns:cx="http://schemas.microsoft.com/office/drawing/2014/chartex" xmlns:cx1="http://schemas.microsoft.com/office/drawing/2015/9/8/chartex" xmlns:cx2="http://schemas.microsoft.com/office/drawing/2015/10/21/chartex" xmlns:cx3="http://schemas.microsoft.com/office/drawing/2016/5/9/chartex" xmlns:cx4="http://schemas.microsoft.com/office/drawing/2016/5/10/chartex" xmlns:cx5="http://schemas.microsoft.com/office/drawing/2016/5/11/chartex" xmlns:cx6="http://schemas.microsoft.com/office/drawing/2016/5/12/chartex" xmlns:cx7="http://schemas.microsoft.com/office/drawing/2016/5/13/chartex" xmlns:cx8="http://schemas.microsoft.com/office/drawing/2016/5/14/chartex" xmlns:mc="http://schemas.openxmlformats.org/markup-compatibility/2006" xmlns:aink="http://schemas.microsoft.com/office/drawing/2016/ink" xmlns:am3d="http://schemas.microsoft.com/office/drawing/2017/model3d" xmlns:o="urn:schemas-microsoft-com:office:office" xmlns:oel="http://schemas.microsoft.com/office/2019/extlst" xmlns:r="http://schemas.openxmlformats.org/officeDocument/2006/relationships" xmlns:m="http://schemas.openxmlformats.org/officeDocument/2006/math" xmlns:v="urn:schemas-microsoft-com:vml" xmlns:wp14="http://schemas.microsoft.com/office/word/2010/wordprocessingDrawing" xmlns:wp="http://schemas.openxmlformats.org/drawingml/2006/wordprocessingDrawing" xmlns:w10="urn:schemas-microsoft-com:office:word" xmlns:w="http://schemas.openxmlformats.org/wordprocessingml/2006/main" xmlns:w14="http://schemas.microsoft.com/office/word/2010/wordml" xmlns:w15="http://schemas.microsoft.com/office/word/2012/wordml" xmlns:w16cei="http://schemas.microsoft.com/office/word/2026/wordml/cei" xmlns:w16cex="http://schemas.microsoft.com/office/word/2018/wordml/cex" xmlns:w16cid="http://schemas.microsoft.com/office/word/2016/wordml/cid" xmlns:w16="http://schemas.microsoft.com/office/word/2018/wordml" xmlns:w16du="http://schemas.microsoft.com/office/word/2023/wordml/word16du" xmlns:w16sdtdh="http://schemas.microsoft.com/office/word/2020/wordml/sdtdatahash" xmlns:w16sdtfl="http://schemas.microsoft.com/office/word/2024/wordml/sdtformatlock" xmlns:w16se="http://schemas.microsoft.com/office/word/2015/wordml/symex" xmlns:wpg="http://schemas.microsoft.com/office/word/2010/wordprocessingGroup" xmlns:wpi="http://schemas.microsoft.com/office/word/2010/wordprocessingInk" xmlns:wne="http://schemas.microsoft.com/office/word/2006/wordml" xmlns:wps="http://schemas.microsoft.com/office/word/2010/wordprocessingShape" mc:Ignorable="w14 w15 w16se w16cid w16 w16cex w16sdtdh w16sdtfl w16du wp14">
   <w:body>
     <w:p>
       <w:pPr>
@@ -218,33 +218,13 @@
           <w:b/>
           <w:bCs/>
         </w:rPr>
-        <w:t>Krania.ai</w:t>
-      </w:r>
-      <w:r>
-        <w:rPr>
-          <w:b/>
-          <w:bCs/>
-        </w:rPr>
-        <w:t xml:space="preserve"> Real-Time Fraud Detection </w:t>
-      </w:r>
-      <w:r>
-        <w:rPr>
-          <w:b/>
-          <w:bCs/>
-        </w:rPr>
-        <w:t>Platform</w:t>
-      </w:r>
-      <w:r>
-        <w:rPr>
-          <w:color w:val="5A5448"/>
-        </w:rPr>
-        <w:t xml:space="preserve"> </w:t>
-      </w:r>
-      <w:r>
-        <w:rPr>
-          <w:color w:val="5A5448"/>
-        </w:rPr>
-        <w:t xml:space="preserve">  Mini-Project Thesis, ISBAT University</w:t>
+        <w:t>Krania.ai Real-Time Fraud Detection Platform</w:t>
+      </w:r>
+      <w:r>
+        <w:rPr>
+          <w:color w:val="5A5448"/>
+        </w:rPr>
+        <w:t xml:space="preserve">   Mini-Project Thesis, ISBAT University</w:t>
       </w:r>
       <w:r>
         <w:rPr>
@@ -401,13 +381,7 @@
         <w:rPr>
           <w:color w:val="5A5448"/>
         </w:rPr>
-        <w:t xml:space="preserve">   </w:t>
-      </w:r>
-      <w:r>
-        <w:rPr>
-          <w:color w:val="5A5448"/>
-        </w:rPr>
-        <w:t xml:space="preserve"> Website</w:t>
+        <w:t xml:space="preserve">    Website</w:t>
       </w:r>
       <w:r>
         <w:rPr>
@@ -480,26 +454,13 @@
           <w:b/>
           <w:bCs/>
         </w:rPr>
-        <w:t>Nzuri</w:t>
-      </w:r>
-      <w:r>
-        <w:rPr>
-          <w:b/>
-          <w:bCs/>
-        </w:rPr>
-        <w:t xml:space="preserve"> AI</w:t>
-      </w:r>
-      <w:r>
-        <w:rPr>
-          <w:color w:val="5A5448"/>
-        </w:rPr>
-        <w:t xml:space="preserve"> — </w:t>
-      </w:r>
-      <w:r>
-        <w:rPr>
-          <w:color w:val="5A5448"/>
-        </w:rPr>
-        <w:t>An offline AI assistant</w:t>
+        <w:t>Nzuri AI</w:t>
+      </w:r>
+      <w:r>
+        <w:rPr>
+          <w:color w:val="5A5448"/>
+        </w:rPr>
+        <w:t xml:space="preserve"> — An offline AI assistant</w:t>
       </w:r>
       <w:r>
         <w:rPr>
@@ -561,13 +522,7 @@
         <w:rPr>
           <w:color w:val="5A5448"/>
         </w:rPr>
-        <w:t xml:space="preserve"> — Collaboration with</w:t>
-      </w:r>
-      <w:r>
-        <w:rPr>
-          <w:color w:val="5A5448"/>
-        </w:rPr>
-        <w:t xml:space="preserve"> Mark Paul</w:t>
+        <w:t xml:space="preserve"> — Collaboration with Mark Paul</w:t>
       </w:r>
       <w:r>
         <w:rPr>
@@ -595,6 +550,51 @@
           <w:szCs w:val="19"/>
         </w:rPr>
         <w:t>Produced SVG figures and reformatted the thesis document to match academic quality benchmarks, in collaboration with Atiki Clovis.</w:t>
+      </w:r>
+    </w:p>
+    <w:p>
+      <w:pPr>
+        <w:spacing w:after="30"/>
+      </w:pPr>
+      <w:r>
+        <w:rPr>
+          <w:b/>
+          <w:bCs/>
+        </w:rPr>
+        <w:t>SAANA-</w:t>
+      </w:r>
+      <w:r>
+        <w:t xml:space="preserve"> A website for Contemporary African Art.</w:t>
+      </w:r>
+    </w:p>
+    <w:p>
+      <w:pPr>
+        <w:spacing w:after="30"/>
+      </w:pPr>
+      <w:r>
+        <w:rPr>
+          <w:b/>
+          <w:bCs/>
+        </w:rPr>
+        <w:t>PROCURA</w:t>
+      </w:r>
+      <w:r>
+        <w:t>- A website for Procura Publishing.</w:t>
+      </w:r>
+    </w:p>
+    <w:p>
+      <w:pPr>
+        <w:spacing w:after="30"/>
+      </w:pPr>
+      <w:r>
+        <w:rPr>
+          <w:b/>
+          <w:bCs/>
+        </w:rPr>
+        <w:t>Grace &amp; Pages</w:t>
+      </w:r>
+      <w:r>
+        <w:t xml:space="preserve">- A devotional website </w:t>
       </w:r>
     </w:p>
     <w:p>
@@ -771,7 +771,7 @@
 </file>
 
 <file path=word/numbering.xml><?xml version="1.0" encoding="utf-8"?>
-<w:numbering xmlns:wpc="http://schemas.microsoft.com/office/word/2010/wordprocessingCanvas" xmlns:cx="http://schemas.microsoft.com/office/drawing/2014/chartex" xmlns:cx1="http://schemas.microsoft.com/office/drawing/2015/9/8/chartex" xmlns:cx2="http://schemas.microsoft.com/office/drawing/2015/10/21/chartex" xmlns:cx3="http://schemas.microsoft.com/office/drawing/2016/5/9/chartex" xmlns:cx4="http://schemas.microsoft.com/office/drawing/2016/5/10/chartex" xmlns:cx5="http://schemas.microsoft.com/office/drawing/2016/5/11/chartex" xmlns:cx6="http://schemas.microsoft.com/office/drawing/2016/5/12/chartex" xmlns:cx7="http://schemas.microsoft.com/office/drawing/2016/5/13/chartex" xmlns:cx8="http://schemas.microsoft.com/office/drawing/2016/5/14/chartex" xmlns:mc="http://schemas.openxmlformats.org/markup-compatibility/2006" xmlns:aink="http://schemas.microsoft.com/office/drawing/2016/ink" xmlns:am3d="http://schemas.microsoft.com/office/drawing/2017/model3d" xmlns:o="urn:schemas-microsoft-com:office:office" xmlns:oel="http://schemas.microsoft.com/office/2019/extlst" xmlns:r="http://schemas.openxmlformats.org/officeDocument/2006/relationships" xmlns:m="http://schemas.openxmlformats.org/officeDocument/2006/math" xmlns:v="urn:schemas-microsoft-com:vml" xmlns:wp14="http://schemas.microsoft.com/office/word/2010/wordprocessingDrawing" xmlns:wp="http://schemas.openxmlformats.org/drawingml/2006/wordprocessingDrawing" xmlns:w10="urn:schemas-microsoft-com:office:word" xmlns:w="http://schemas.openxmlformats.org/wordprocessingml/2006/main" xmlns:w14="http://schemas.microsoft.com/office/word/2010/wordml" xmlns:w15="http://schemas.microsoft.com/office/word/2012/wordml" xmlns:w16cex="http://schemas.microsoft.com/office/word/2018/wordml/cex" xmlns:w16cid="http://schemas.microsoft.com/office/word/2016/wordml/cid" xmlns:w16="http://schemas.microsoft.com/office/word/2018/wordml" xmlns:w16du="http://schemas.microsoft.com/office/word/2023/wordml/word16du" xmlns:w16sdtdh="http://schemas.microsoft.com/office/word/2020/wordml/sdtdatahash" xmlns:w16sdtfl="http://schemas.microsoft.com/office/word/2024/wordml/sdtformatlock" xmlns:w16se="http://schemas.microsoft.com/office/word/2015/wordml/symex" xmlns:wpg="http://schemas.microsoft.com/office/word/2010/wordprocessingGroup" xmlns:wpi="http://schemas.microsoft.com/office/word/2010/wordprocessingInk" xmlns:wne="http://schemas.microsoft.com/office/word/2006/wordml" xmlns:wps="http://schemas.microsoft.com/office/word/2010/wordprocessingShape" mc:Ignorable="w14 w15 w16se w16cid w16 w16cex w16sdtdh w16sdtfl w16du wp14">
+<w:numbering xmlns:wpc="http://schemas.microsoft.com/office/word/2010/wordprocessingCanvas" xmlns:cx="http://schemas.microsoft.com/office/drawing/2014/chartex" xmlns:cx1="http://schemas.microsoft.com/office/drawing/2015/9/8/chartex" xmlns:cx2="http://schemas.microsoft.com/office/drawing/2015/10/21/chartex" xmlns:cx3="http://schemas.microsoft.com/office/drawing/2016/5/9/chartex" xmlns:cx4="http://schemas.microsoft.com/office/drawing/2016/5/10/chartex" xmlns:cx5="http://schemas.microsoft.com/office/drawing/2016/5/11/chartex" xmlns:cx6="http://schemas.microsoft.com/office/drawing/2016/5/12/chartex" xmlns:cx7="http://schemas.microsoft.com/office/drawing/2016/5/13/chartex" xmlns:cx8="http://schemas.microsoft.com/office/drawing/2016/5/14/chartex" xmlns:mc="http://schemas.openxmlformats.org/markup-compatibility/2006" xmlns:aink="http://schemas.microsoft.com/office/drawing/2016/ink" xmlns:am3d="http://schemas.microsoft.com/office/drawing/2017/model3d" xmlns:o="urn:schemas-microsoft-com:office:office" xmlns:oel="http://schemas.microsoft.com/office/2019/extlst" xmlns:r="http://schemas.openxmlformats.org/officeDocument/2006/relationships" xmlns:m="http://schemas.openxmlformats.org/officeDocument/2006/math" xmlns:v="urn:schemas-microsoft-com:vml" xmlns:wp14="http://schemas.microsoft.com/office/word/2010/wordprocessingDrawing" xmlns:wp="http://schemas.openxmlformats.org/drawingml/2006/wordprocessingDrawing" xmlns:w10="urn:schemas-microsoft-com:office:word" xmlns:w="http://schemas.openxmlformats.org/wordprocessingml/2006/main" xmlns:w14="http://schemas.microsoft.com/office/word/2010/wordml" xmlns:w15="http://schemas.microsoft.com/office/word/2012/wordml" xmlns:w16cei="http://schemas.microsoft.com/office/word/2026/wordml/cei" xmlns:w16cex="http://schemas.microsoft.com/office/word/2018/wordml/cex" xmlns:w16cid="http://schemas.microsoft.com/office/word/2016/wordml/cid" xmlns:w16="http://schemas.microsoft.com/office/word/2018/wordml" xmlns:w16du="http://schemas.microsoft.com/office/word/2023/wordml/word16du" xmlns:w16sdtdh="http://schemas.microsoft.com/office/word/2020/wordml/sdtdatahash" xmlns:w16sdtfl="http://schemas.microsoft.com/office/word/2024/wordml/sdtformatlock" xmlns:w16se="http://schemas.microsoft.com/office/word/2015/wordml/symex" xmlns:wpg="http://schemas.microsoft.com/office/word/2010/wordprocessingGroup" xmlns:wpi="http://schemas.microsoft.com/office/word/2010/wordprocessingInk" xmlns:wne="http://schemas.microsoft.com/office/word/2006/wordml" xmlns:wps="http://schemas.microsoft.com/office/word/2010/wordprocessingShape" mc:Ignorable="w14 w15 w16se w16cid w16 w16cex w16sdtdh w16sdtfl w16du wp14">
   <w:abstractNum w:abstractNumId="0" w15:restartNumberingAfterBreak="0">
     <w:nsid w:val="02647402"/>
     <w:multiLevelType w:val="hybridMultilevel"/>

</xml_diff>